<commit_message>
Requested changes made to Section 3
Strengthen Section 3.5 with  explicit GitHub workflow, OneDrive practices, and deployment plan.
</commit_message>
<xml_diff>
--- a/docs/D1/Section 3 Polished.docx
+++ b/docs/D1/Section 3 Polished.docx
@@ -190,7 +190,15 @@
         </w:numPr>
       </w:pPr>
       <w:r>
-        <w:t>Identify specific cultural heritage sites (e.g., granite outcrops, scar trees, rock art) that require protection.</w:t>
+        <w:t xml:space="preserve">Identify specific cultural heritage sites (e.g., granite outcrops, </w:t>
+      </w:r>
+      <w:proofErr w:type="gramStart"/>
+      <w:r>
+        <w:t>scar</w:t>
+      </w:r>
+      <w:proofErr w:type="gramEnd"/>
+      <w:r>
+        <w:t xml:space="preserve"> trees, rock art) that require protection.</w:t>
       </w:r>
     </w:p>
     <w:p>
@@ -394,50 +402,48 @@
     </w:p>
     <w:p>
       <w:r>
-        <w:t xml:space="preserve">The project follows a structured timeline to ensure every deliverable is completed on time. </w:t>
+        <w:t xml:space="preserve">The project follows a structured timeline to ensure every </w:t>
+      </w:r>
+      <w:proofErr w:type="gramStart"/>
+      <w:r>
+        <w:t>deliverable</w:t>
+      </w:r>
+      <w:proofErr w:type="gramEnd"/>
+      <w:r>
+        <w:t xml:space="preserve"> is completed on time. </w:t>
       </w:r>
     </w:p>
     <w:tbl>
       <w:tblPr>
-        <w:tblW w:w="0" w:type="auto"/>
-        <w:tblCellSpacing w:w="15" w:type="dxa"/>
-        <w:tblCellMar>
-          <w:top w:w="15" w:type="dxa"/>
-          <w:left w:w="15" w:type="dxa"/>
-          <w:bottom w:w="15" w:type="dxa"/>
-          <w:right w:w="15" w:type="dxa"/>
-        </w:tblCellMar>
+        <w:tblStyle w:val="PlainTable1"/>
+        <w:tblW w:w="9528" w:type="dxa"/>
         <w:tblLook w:val="04A0" w:firstRow="1" w:lastRow="0" w:firstColumn="1" w:lastColumn="0" w:noHBand="0" w:noVBand="1"/>
       </w:tblPr>
       <w:tblGrid>
-        <w:gridCol w:w="688"/>
-        <w:gridCol w:w="1779"/>
-        <w:gridCol w:w="4993"/>
-        <w:gridCol w:w="1900"/>
+        <w:gridCol w:w="829"/>
+        <w:gridCol w:w="1906"/>
+        <w:gridCol w:w="4788"/>
+        <w:gridCol w:w="2005"/>
       </w:tblGrid>
       <w:tr>
         <w:trPr>
-          <w:tblHeader/>
-          <w:tblCellSpacing w:w="15" w:type="dxa"/>
+          <w:cnfStyle w:val="100000000000" w:firstRow="1" w:lastRow="0" w:firstColumn="0" w:lastColumn="0" w:oddVBand="0" w:evenVBand="0" w:oddHBand="0" w:evenHBand="0" w:firstRowFirstColumn="0" w:firstRowLastColumn="0" w:lastRowFirstColumn="0" w:lastRowLastColumn="0"/>
+          <w:trHeight w:val="426"/>
         </w:trPr>
         <w:tc>
           <w:tcPr>
-            <w:tcW w:w="0" w:type="auto"/>
-            <w:vAlign w:val="center"/>
+            <w:cnfStyle w:val="001000000000" w:firstRow="0" w:lastRow="0" w:firstColumn="1" w:lastColumn="0" w:oddVBand="0" w:evenVBand="0" w:oddHBand="0" w:evenHBand="0" w:firstRowFirstColumn="0" w:firstRowLastColumn="0" w:lastRowFirstColumn="0" w:lastRowLastColumn="0"/>
+            <w:tcW w:w="0" w:type="auto"/>
             <w:hideMark/>
           </w:tcPr>
           <w:p>
             <w:pPr>
               <w:rPr>
-                <w:b/>
-                <w:bCs/>
+                <w:b w:val="0"/>
+                <w:bCs w:val="0"/>
               </w:rPr>
             </w:pPr>
             <w:r>
-              <w:rPr>
-                <w:b/>
-                <w:bCs/>
-              </w:rPr>
               <w:lastRenderedPageBreak/>
               <w:t>Week</w:t>
             </w:r>
@@ -446,65 +452,53 @@
         <w:tc>
           <w:tcPr>
             <w:tcW w:w="0" w:type="auto"/>
-            <w:vAlign w:val="center"/>
-            <w:hideMark/>
-          </w:tcPr>
-          <w:p>
-            <w:pPr>
+            <w:hideMark/>
+          </w:tcPr>
+          <w:p>
+            <w:pPr>
+              <w:cnfStyle w:val="100000000000" w:firstRow="1" w:lastRow="0" w:firstColumn="0" w:lastColumn="0" w:oddVBand="0" w:evenVBand="0" w:oddHBand="0" w:evenHBand="0" w:firstRowFirstColumn="0" w:firstRowLastColumn="0" w:lastRowFirstColumn="0" w:lastRowLastColumn="0"/>
               <w:rPr>
-                <w:b/>
-                <w:bCs/>
+                <w:b w:val="0"/>
+                <w:bCs w:val="0"/>
               </w:rPr>
             </w:pPr>
             <w:r>
+              <w:t>Phase</w:t>
+            </w:r>
+          </w:p>
+        </w:tc>
+        <w:tc>
+          <w:tcPr>
+            <w:tcW w:w="0" w:type="auto"/>
+            <w:hideMark/>
+          </w:tcPr>
+          <w:p>
+            <w:pPr>
+              <w:cnfStyle w:val="100000000000" w:firstRow="1" w:lastRow="0" w:firstColumn="0" w:lastColumn="0" w:oddVBand="0" w:evenVBand="0" w:oddHBand="0" w:evenHBand="0" w:firstRowFirstColumn="0" w:firstRowLastColumn="0" w:lastRowFirstColumn="0" w:lastRowLastColumn="0"/>
               <w:rPr>
-                <w:b/>
-                <w:bCs/>
+                <w:b w:val="0"/>
+                <w:bCs w:val="0"/>
               </w:rPr>
-              <w:t>Phase</w:t>
-            </w:r>
-          </w:p>
-        </w:tc>
-        <w:tc>
-          <w:tcPr>
-            <w:tcW w:w="0" w:type="auto"/>
-            <w:vAlign w:val="center"/>
-            <w:hideMark/>
-          </w:tcPr>
-          <w:p>
-            <w:pPr>
+            </w:pPr>
+            <w:r>
+              <w:t>Key Tasks</w:t>
+            </w:r>
+          </w:p>
+        </w:tc>
+        <w:tc>
+          <w:tcPr>
+            <w:tcW w:w="0" w:type="auto"/>
+            <w:hideMark/>
+          </w:tcPr>
+          <w:p>
+            <w:pPr>
+              <w:cnfStyle w:val="100000000000" w:firstRow="1" w:lastRow="0" w:firstColumn="0" w:lastColumn="0" w:oddVBand="0" w:evenVBand="0" w:oddHBand="0" w:evenHBand="0" w:firstRowFirstColumn="0" w:firstRowLastColumn="0" w:lastRowFirstColumn="0" w:lastRowLastColumn="0"/>
               <w:rPr>
-                <w:b/>
-                <w:bCs/>
+                <w:b w:val="0"/>
+                <w:bCs w:val="0"/>
               </w:rPr>
             </w:pPr>
             <w:r>
-              <w:rPr>
-                <w:b/>
-                <w:bCs/>
-              </w:rPr>
-              <w:t>Key Tasks</w:t>
-            </w:r>
-          </w:p>
-        </w:tc>
-        <w:tc>
-          <w:tcPr>
-            <w:tcW w:w="0" w:type="auto"/>
-            <w:vAlign w:val="center"/>
-            <w:hideMark/>
-          </w:tcPr>
-          <w:p>
-            <w:pPr>
-              <w:rPr>
-                <w:b/>
-                <w:bCs/>
-              </w:rPr>
-            </w:pPr>
-            <w:r>
-              <w:rPr>
-                <w:b/>
-                <w:bCs/>
-              </w:rPr>
               <w:t>Milestone</w:t>
             </w:r>
           </w:p>
@@ -512,12 +506,13 @@
       </w:tr>
       <w:tr>
         <w:trPr>
-          <w:tblCellSpacing w:w="15" w:type="dxa"/>
+          <w:cnfStyle w:val="000000100000" w:firstRow="0" w:lastRow="0" w:firstColumn="0" w:lastColumn="0" w:oddVBand="0" w:evenVBand="0" w:oddHBand="1" w:evenHBand="0" w:firstRowFirstColumn="0" w:firstRowLastColumn="0" w:lastRowFirstColumn="0" w:lastRowLastColumn="0"/>
+          <w:trHeight w:val="881"/>
         </w:trPr>
         <w:tc>
           <w:tcPr>
-            <w:tcW w:w="0" w:type="auto"/>
-            <w:vAlign w:val="center"/>
+            <w:cnfStyle w:val="001000000000" w:firstRow="0" w:lastRow="0" w:firstColumn="1" w:lastColumn="0" w:oddVBand="0" w:evenVBand="0" w:oddHBand="0" w:evenHBand="0" w:firstRowFirstColumn="0" w:firstRowLastColumn="0" w:lastRowFirstColumn="0" w:lastRowLastColumn="0"/>
+            <w:tcW w:w="0" w:type="auto"/>
             <w:hideMark/>
           </w:tcPr>
           <w:p>
@@ -529,10 +524,12 @@
         <w:tc>
           <w:tcPr>
             <w:tcW w:w="0" w:type="auto"/>
-            <w:vAlign w:val="center"/>
-            <w:hideMark/>
-          </w:tcPr>
-          <w:p>
+            <w:hideMark/>
+          </w:tcPr>
+          <w:p>
+            <w:pPr>
+              <w:cnfStyle w:val="000000100000" w:firstRow="0" w:lastRow="0" w:firstColumn="0" w:lastColumn="0" w:oddVBand="0" w:evenVBand="0" w:oddHBand="1" w:evenHBand="0" w:firstRowFirstColumn="0" w:firstRowLastColumn="0" w:lastRowFirstColumn="0" w:lastRowLastColumn="0"/>
+            </w:pPr>
             <w:r>
               <w:t>Requirements &amp; Setup</w:t>
             </w:r>
@@ -541,10 +538,12 @@
         <w:tc>
           <w:tcPr>
             <w:tcW w:w="0" w:type="auto"/>
-            <w:vAlign w:val="center"/>
-            <w:hideMark/>
-          </w:tcPr>
-          <w:p>
+            <w:hideMark/>
+          </w:tcPr>
+          <w:p>
+            <w:pPr>
+              <w:cnfStyle w:val="000000100000" w:firstRow="0" w:lastRow="0" w:firstColumn="0" w:lastColumn="0" w:oddVBand="0" w:evenVBand="0" w:oddHBand="1" w:evenHBand="0" w:firstRowFirstColumn="0" w:firstRowLastColumn="0" w:lastRowFirstColumn="0" w:lastRowLastColumn="0"/>
+            </w:pPr>
             <w:r>
               <w:t>Initial client meetings, confirm project scope, set up GitHub and Teams channels</w:t>
             </w:r>
@@ -553,10 +552,12 @@
         <w:tc>
           <w:tcPr>
             <w:tcW w:w="0" w:type="auto"/>
-            <w:vAlign w:val="center"/>
-            <w:hideMark/>
-          </w:tcPr>
-          <w:p>
+            <w:hideMark/>
+          </w:tcPr>
+          <w:p>
+            <w:pPr>
+              <w:cnfStyle w:val="000000100000" w:firstRow="0" w:lastRow="0" w:firstColumn="0" w:lastColumn="0" w:oddVBand="0" w:evenVBand="0" w:oddHBand="1" w:evenHBand="0" w:firstRowFirstColumn="0" w:firstRowLastColumn="0" w:lastRowFirstColumn="0" w:lastRowLastColumn="0"/>
+            </w:pPr>
             <w:r>
               <w:t>Project kickoff</w:t>
             </w:r>
@@ -565,12 +566,12 @@
       </w:tr>
       <w:tr>
         <w:trPr>
-          <w:tblCellSpacing w:w="15" w:type="dxa"/>
+          <w:trHeight w:val="2651"/>
         </w:trPr>
         <w:tc>
           <w:tcPr>
-            <w:tcW w:w="0" w:type="auto"/>
-            <w:vAlign w:val="center"/>
+            <w:cnfStyle w:val="001000000000" w:firstRow="0" w:lastRow="0" w:firstColumn="1" w:lastColumn="0" w:oddVBand="0" w:evenVBand="0" w:oddHBand="0" w:evenHBand="0" w:firstRowFirstColumn="0" w:firstRowLastColumn="0" w:lastRowFirstColumn="0" w:lastRowLastColumn="0"/>
+            <w:tcW w:w="0" w:type="auto"/>
             <w:hideMark/>
           </w:tcPr>
           <w:p>
@@ -582,10 +583,12 @@
         <w:tc>
           <w:tcPr>
             <w:tcW w:w="0" w:type="auto"/>
-            <w:vAlign w:val="center"/>
-            <w:hideMark/>
-          </w:tcPr>
-          <w:p>
+            <w:hideMark/>
+          </w:tcPr>
+          <w:p>
+            <w:pPr>
+              <w:cnfStyle w:val="000000000000" w:firstRow="0" w:lastRow="0" w:firstColumn="0" w:lastColumn="0" w:oddVBand="0" w:evenVBand="0" w:oddHBand="0" w:evenHBand="0" w:firstRowFirstColumn="0" w:firstRowLastColumn="0" w:lastRowFirstColumn="0" w:lastRowLastColumn="0"/>
+            </w:pPr>
             <w:r>
               <w:t>Research &amp; Consultation</w:t>
             </w:r>
@@ -594,10 +597,12 @@
         <w:tc>
           <w:tcPr>
             <w:tcW w:w="0" w:type="auto"/>
-            <w:vAlign w:val="center"/>
-            <w:hideMark/>
-          </w:tcPr>
-          <w:p>
+            <w:hideMark/>
+          </w:tcPr>
+          <w:p>
+            <w:pPr>
+              <w:cnfStyle w:val="000000000000" w:firstRow="0" w:lastRow="0" w:firstColumn="0" w:lastColumn="0" w:oddVBand="0" w:evenVBand="0" w:oddHBand="0" w:evenHBand="0" w:firstRowFirstColumn="0" w:firstRowLastColumn="0" w:lastRowFirstColumn="0" w:lastRowLastColumn="0"/>
+            </w:pPr>
             <w:r>
               <w:t xml:space="preserve">Meeting with Sean Winter (domain specialist and primary user) to refine requirements; conduct background research on wildfire </w:t>
             </w:r>
@@ -614,10 +619,12 @@
         <w:tc>
           <w:tcPr>
             <w:tcW w:w="0" w:type="auto"/>
-            <w:vAlign w:val="center"/>
-            <w:hideMark/>
-          </w:tcPr>
-          <w:p>
+            <w:hideMark/>
+          </w:tcPr>
+          <w:p>
+            <w:pPr>
+              <w:cnfStyle w:val="000000000000" w:firstRow="0" w:lastRow="0" w:firstColumn="0" w:lastColumn="0" w:oddVBand="0" w:evenVBand="0" w:oddHBand="0" w:evenHBand="0" w:firstRowFirstColumn="0" w:firstRowLastColumn="0" w:lastRowFirstColumn="0" w:lastRowLastColumn="0"/>
+            </w:pPr>
             <w:r>
               <w:t>Domain understanding confirmed</w:t>
             </w:r>
@@ -626,12 +633,13 @@
       </w:tr>
       <w:tr>
         <w:trPr>
-          <w:tblCellSpacing w:w="15" w:type="dxa"/>
+          <w:cnfStyle w:val="000000100000" w:firstRow="0" w:lastRow="0" w:firstColumn="0" w:lastColumn="0" w:oddVBand="0" w:evenVBand="0" w:oddHBand="1" w:evenHBand="0" w:firstRowFirstColumn="0" w:firstRowLastColumn="0" w:lastRowFirstColumn="0" w:lastRowLastColumn="0"/>
+          <w:trHeight w:val="1765"/>
         </w:trPr>
         <w:tc>
           <w:tcPr>
-            <w:tcW w:w="0" w:type="auto"/>
-            <w:vAlign w:val="center"/>
+            <w:cnfStyle w:val="001000000000" w:firstRow="0" w:lastRow="0" w:firstColumn="1" w:lastColumn="0" w:oddVBand="0" w:evenVBand="0" w:oddHBand="0" w:evenHBand="0" w:firstRowFirstColumn="0" w:firstRowLastColumn="0" w:lastRowFirstColumn="0" w:lastRowLastColumn="0"/>
+            <w:tcW w:w="0" w:type="auto"/>
             <w:hideMark/>
           </w:tcPr>
           <w:p>
@@ -643,10 +651,12 @@
         <w:tc>
           <w:tcPr>
             <w:tcW w:w="0" w:type="auto"/>
-            <w:vAlign w:val="center"/>
-            <w:hideMark/>
-          </w:tcPr>
-          <w:p>
+            <w:hideMark/>
+          </w:tcPr>
+          <w:p>
+            <w:pPr>
+              <w:cnfStyle w:val="000000100000" w:firstRow="0" w:lastRow="0" w:firstColumn="0" w:lastColumn="0" w:oddVBand="0" w:evenVBand="0" w:oddHBand="1" w:evenHBand="0" w:firstRowFirstColumn="0" w:firstRowLastColumn="0" w:lastRowFirstColumn="0" w:lastRowLastColumn="0"/>
+            </w:pPr>
             <w:r>
               <w:t>Data Exploration &amp; D1 Prep</w:t>
             </w:r>
@@ -655,10 +665,12 @@
         <w:tc>
           <w:tcPr>
             <w:tcW w:w="0" w:type="auto"/>
-            <w:vAlign w:val="center"/>
-            <w:hideMark/>
-          </w:tcPr>
-          <w:p>
+            <w:hideMark/>
+          </w:tcPr>
+          <w:p>
+            <w:pPr>
+              <w:cnfStyle w:val="000000100000" w:firstRow="0" w:lastRow="0" w:firstColumn="0" w:lastColumn="0" w:oddVBand="0" w:evenVBand="0" w:oddHBand="1" w:evenHBand="0" w:firstRowFirstColumn="0" w:firstRowLastColumn="0" w:lastRowFirstColumn="0" w:lastRowLastColumn="0"/>
+            </w:pPr>
             <w:r>
               <w:t>Collect and explore relevant datasets (ACHIS, granite outcrops, topography, vegetation, fuel load); prepare and finalize D1</w:t>
             </w:r>
@@ -667,10 +679,12 @@
         <w:tc>
           <w:tcPr>
             <w:tcW w:w="0" w:type="auto"/>
-            <w:vAlign w:val="center"/>
-            <w:hideMark/>
-          </w:tcPr>
-          <w:p>
+            <w:hideMark/>
+          </w:tcPr>
+          <w:p>
+            <w:pPr>
+              <w:cnfStyle w:val="000000100000" w:firstRow="0" w:lastRow="0" w:firstColumn="0" w:lastColumn="0" w:oddVBand="0" w:evenVBand="0" w:oddHBand="1" w:evenHBand="0" w:firstRowFirstColumn="0" w:firstRowLastColumn="0" w:lastRowFirstColumn="0" w:lastRowLastColumn="0"/>
+            </w:pPr>
             <w:r>
               <w:rPr>
                 <w:b/>
@@ -683,12 +697,12 @@
       </w:tr>
       <w:tr>
         <w:trPr>
-          <w:tblCellSpacing w:w="15" w:type="dxa"/>
+          <w:trHeight w:val="1313"/>
         </w:trPr>
         <w:tc>
           <w:tcPr>
-            <w:tcW w:w="0" w:type="auto"/>
-            <w:vAlign w:val="center"/>
+            <w:cnfStyle w:val="001000000000" w:firstRow="0" w:lastRow="0" w:firstColumn="1" w:lastColumn="0" w:oddVBand="0" w:evenVBand="0" w:oddHBand="0" w:evenHBand="0" w:firstRowFirstColumn="0" w:firstRowLastColumn="0" w:lastRowFirstColumn="0" w:lastRowLastColumn="0"/>
+            <w:tcW w:w="0" w:type="auto"/>
             <w:hideMark/>
           </w:tcPr>
           <w:p>
@@ -700,10 +714,12 @@
         <w:tc>
           <w:tcPr>
             <w:tcW w:w="0" w:type="auto"/>
-            <w:vAlign w:val="center"/>
-            <w:hideMark/>
-          </w:tcPr>
-          <w:p>
+            <w:hideMark/>
+          </w:tcPr>
+          <w:p>
+            <w:pPr>
+              <w:cnfStyle w:val="000000000000" w:firstRow="0" w:lastRow="0" w:firstColumn="0" w:lastColumn="0" w:oddVBand="0" w:evenVBand="0" w:oddHBand="0" w:evenHBand="0" w:firstRowFirstColumn="0" w:firstRowLastColumn="0" w:lastRowFirstColumn="0" w:lastRowLastColumn="0"/>
+            </w:pPr>
             <w:r>
               <w:t>D1 Feedback &amp; Planning</w:t>
             </w:r>
@@ -712,10 +728,12 @@
         <w:tc>
           <w:tcPr>
             <w:tcW w:w="0" w:type="auto"/>
-            <w:vAlign w:val="center"/>
-            <w:hideMark/>
-          </w:tcPr>
-          <w:p>
+            <w:hideMark/>
+          </w:tcPr>
+          <w:p>
+            <w:pPr>
+              <w:cnfStyle w:val="000000000000" w:firstRow="0" w:lastRow="0" w:firstColumn="0" w:lastColumn="0" w:oddVBand="0" w:evenVBand="0" w:oddHBand="0" w:evenHBand="0" w:firstRowFirstColumn="0" w:firstRowLastColumn="0" w:lastRowFirstColumn="0" w:lastRowLastColumn="0"/>
+            </w:pPr>
             <w:r>
               <w:t>Present proposed approach to client and facilitator; incorporate feedback into development plan</w:t>
             </w:r>
@@ -724,10 +742,12 @@
         <w:tc>
           <w:tcPr>
             <w:tcW w:w="0" w:type="auto"/>
-            <w:vAlign w:val="center"/>
-            <w:hideMark/>
-          </w:tcPr>
-          <w:p>
+            <w:hideMark/>
+          </w:tcPr>
+          <w:p>
+            <w:pPr>
+              <w:cnfStyle w:val="000000000000" w:firstRow="0" w:lastRow="0" w:firstColumn="0" w:lastColumn="0" w:oddVBand="0" w:evenVBand="0" w:oddHBand="0" w:evenHBand="0" w:firstRowFirstColumn="0" w:firstRowLastColumn="0" w:lastRowFirstColumn="0" w:lastRowLastColumn="0"/>
+            </w:pPr>
             <w:r>
               <w:t>Selection of Region</w:t>
             </w:r>
@@ -736,12 +756,13 @@
       </w:tr>
       <w:tr>
         <w:trPr>
-          <w:tblCellSpacing w:w="15" w:type="dxa"/>
+          <w:cnfStyle w:val="000000100000" w:firstRow="0" w:lastRow="0" w:firstColumn="0" w:lastColumn="0" w:oddVBand="0" w:evenVBand="0" w:oddHBand="1" w:evenHBand="0" w:firstRowFirstColumn="0" w:firstRowLastColumn="0" w:lastRowFirstColumn="0" w:lastRowLastColumn="0"/>
+          <w:trHeight w:val="1765"/>
         </w:trPr>
         <w:tc>
           <w:tcPr>
-            <w:tcW w:w="0" w:type="auto"/>
-            <w:vAlign w:val="center"/>
+            <w:cnfStyle w:val="001000000000" w:firstRow="0" w:lastRow="0" w:firstColumn="1" w:lastColumn="0" w:oddVBand="0" w:evenVBand="0" w:oddHBand="0" w:evenHBand="0" w:firstRowFirstColumn="0" w:firstRowLastColumn="0" w:lastRowFirstColumn="0" w:lastRowLastColumn="0"/>
+            <w:tcW w:w="0" w:type="auto"/>
             <w:hideMark/>
           </w:tcPr>
           <w:p>
@@ -753,10 +774,12 @@
         <w:tc>
           <w:tcPr>
             <w:tcW w:w="0" w:type="auto"/>
-            <w:vAlign w:val="center"/>
-            <w:hideMark/>
-          </w:tcPr>
-          <w:p>
+            <w:hideMark/>
+          </w:tcPr>
+          <w:p>
+            <w:pPr>
+              <w:cnfStyle w:val="000000100000" w:firstRow="0" w:lastRow="0" w:firstColumn="0" w:lastColumn="0" w:oddVBand="0" w:evenVBand="0" w:oddHBand="1" w:evenHBand="0" w:firstRowFirstColumn="0" w:firstRowLastColumn="0" w:lastRowFirstColumn="0" w:lastRowLastColumn="0"/>
+            </w:pPr>
             <w:r>
               <w:t>Data Pipeline &amp; Risk Model</w:t>
             </w:r>
@@ -765,10 +788,12 @@
         <w:tc>
           <w:tcPr>
             <w:tcW w:w="0" w:type="auto"/>
-            <w:vAlign w:val="center"/>
-            <w:hideMark/>
-          </w:tcPr>
-          <w:p>
+            <w:hideMark/>
+          </w:tcPr>
+          <w:p>
+            <w:pPr>
+              <w:cnfStyle w:val="000000100000" w:firstRow="0" w:lastRow="0" w:firstColumn="0" w:lastColumn="0" w:oddVBand="0" w:evenVBand="0" w:oddHBand="1" w:evenHBand="0" w:firstRowFirstColumn="0" w:firstRowLastColumn="0" w:lastRowFirstColumn="0" w:lastRowLastColumn="0"/>
+            </w:pPr>
             <w:r>
               <w:t>Develop working data pipeline; ensure all sites and layers load correctly on the map; begin risk assessment module development</w:t>
             </w:r>
@@ -777,10 +802,12 @@
         <w:tc>
           <w:tcPr>
             <w:tcW w:w="0" w:type="auto"/>
-            <w:vAlign w:val="center"/>
-            <w:hideMark/>
-          </w:tcPr>
-          <w:p>
+            <w:hideMark/>
+          </w:tcPr>
+          <w:p>
+            <w:pPr>
+              <w:cnfStyle w:val="000000100000" w:firstRow="0" w:lastRow="0" w:firstColumn="0" w:lastColumn="0" w:oddVBand="0" w:evenVBand="0" w:oddHBand="1" w:evenHBand="0" w:firstRowFirstColumn="0" w:firstRowLastColumn="0" w:lastRowFirstColumn="0" w:lastRowLastColumn="0"/>
+            </w:pPr>
             <w:r>
               <w:t>Stable data foundation</w:t>
             </w:r>
@@ -789,12 +816,12 @@
       </w:tr>
       <w:tr>
         <w:trPr>
-          <w:tblCellSpacing w:w="15" w:type="dxa"/>
+          <w:trHeight w:val="1313"/>
         </w:trPr>
         <w:tc>
           <w:tcPr>
-            <w:tcW w:w="0" w:type="auto"/>
-            <w:vAlign w:val="center"/>
+            <w:cnfStyle w:val="001000000000" w:firstRow="0" w:lastRow="0" w:firstColumn="1" w:lastColumn="0" w:oddVBand="0" w:evenVBand="0" w:oddHBand="0" w:evenHBand="0" w:firstRowFirstColumn="0" w:firstRowLastColumn="0" w:lastRowFirstColumn="0" w:lastRowLastColumn="0"/>
+            <w:tcW w:w="0" w:type="auto"/>
             <w:hideMark/>
           </w:tcPr>
           <w:p>
@@ -806,10 +833,12 @@
         <w:tc>
           <w:tcPr>
             <w:tcW w:w="0" w:type="auto"/>
-            <w:vAlign w:val="center"/>
-            <w:hideMark/>
-          </w:tcPr>
-          <w:p>
+            <w:hideMark/>
+          </w:tcPr>
+          <w:p>
+            <w:pPr>
+              <w:cnfStyle w:val="000000000000" w:firstRow="0" w:lastRow="0" w:firstColumn="0" w:lastColumn="0" w:oddVBand="0" w:evenVBand="0" w:oddHBand="0" w:evenHBand="0" w:firstRowFirstColumn="0" w:firstRowLastColumn="0" w:lastRowFirstColumn="0" w:lastRowLastColumn="0"/>
+            </w:pPr>
             <w:r>
               <w:t>GIS Application Development</w:t>
             </w:r>
@@ -818,10 +847,12 @@
         <w:tc>
           <w:tcPr>
             <w:tcW w:w="0" w:type="auto"/>
-            <w:vAlign w:val="center"/>
-            <w:hideMark/>
-          </w:tcPr>
-          <w:p>
+            <w:hideMark/>
+          </w:tcPr>
+          <w:p>
+            <w:pPr>
+              <w:cnfStyle w:val="000000000000" w:firstRow="0" w:lastRow="0" w:firstColumn="0" w:lastColumn="0" w:oddVBand="0" w:evenVBand="0" w:oddHBand="0" w:evenHBand="0" w:firstRowFirstColumn="0" w:firstRowLastColumn="0" w:lastRowFirstColumn="0" w:lastRowLastColumn="0"/>
+            </w:pPr>
             <w:r>
               <w:t xml:space="preserve">Integrate risk model into the GIS application; implement </w:t>
             </w:r>
@@ -836,10 +867,12 @@
         <w:tc>
           <w:tcPr>
             <w:tcW w:w="0" w:type="auto"/>
-            <w:vAlign w:val="center"/>
-            <w:hideMark/>
-          </w:tcPr>
-          <w:p>
+            <w:hideMark/>
+          </w:tcPr>
+          <w:p>
+            <w:pPr>
+              <w:cnfStyle w:val="000000000000" w:firstRow="0" w:lastRow="0" w:firstColumn="0" w:lastColumn="0" w:oddVBand="0" w:evenVBand="0" w:oddHBand="0" w:evenHBand="0" w:firstRowFirstColumn="0" w:firstRowLastColumn="0" w:lastRowFirstColumn="0" w:lastRowLastColumn="0"/>
+            </w:pPr>
             <w:r>
               <w:t>Core system functional</w:t>
             </w:r>
@@ -848,12 +881,13 @@
       </w:tr>
       <w:tr>
         <w:trPr>
-          <w:tblCellSpacing w:w="15" w:type="dxa"/>
+          <w:cnfStyle w:val="000000100000" w:firstRow="0" w:lastRow="0" w:firstColumn="0" w:lastColumn="0" w:oddVBand="0" w:evenVBand="0" w:oddHBand="1" w:evenHBand="0" w:firstRowFirstColumn="0" w:firstRowLastColumn="0" w:lastRowFirstColumn="0" w:lastRowLastColumn="0"/>
+          <w:trHeight w:val="881"/>
         </w:trPr>
         <w:tc>
           <w:tcPr>
-            <w:tcW w:w="0" w:type="auto"/>
-            <w:vAlign w:val="center"/>
+            <w:cnfStyle w:val="001000000000" w:firstRow="0" w:lastRow="0" w:firstColumn="1" w:lastColumn="0" w:oddVBand="0" w:evenVBand="0" w:oddHBand="0" w:evenHBand="0" w:firstRowFirstColumn="0" w:firstRowLastColumn="0" w:lastRowFirstColumn="0" w:lastRowLastColumn="0"/>
+            <w:tcW w:w="0" w:type="auto"/>
             <w:hideMark/>
           </w:tcPr>
           <w:p>
@@ -865,10 +899,12 @@
         <w:tc>
           <w:tcPr>
             <w:tcW w:w="0" w:type="auto"/>
-            <w:vAlign w:val="center"/>
-            <w:hideMark/>
-          </w:tcPr>
-          <w:p>
+            <w:hideMark/>
+          </w:tcPr>
+          <w:p>
+            <w:pPr>
+              <w:cnfStyle w:val="000000100000" w:firstRow="0" w:lastRow="0" w:firstColumn="0" w:lastColumn="0" w:oddVBand="0" w:evenVBand="0" w:oddHBand="1" w:evenHBand="0" w:firstRowFirstColumn="0" w:firstRowLastColumn="0" w:lastRowFirstColumn="0" w:lastRowLastColumn="0"/>
+            </w:pPr>
             <w:r>
               <w:t>D2 Submission</w:t>
             </w:r>
@@ -877,10 +913,12 @@
         <w:tc>
           <w:tcPr>
             <w:tcW w:w="0" w:type="auto"/>
-            <w:vAlign w:val="center"/>
-            <w:hideMark/>
-          </w:tcPr>
-          <w:p>
+            <w:hideMark/>
+          </w:tcPr>
+          <w:p>
+            <w:pPr>
+              <w:cnfStyle w:val="000000100000" w:firstRow="0" w:lastRow="0" w:firstColumn="0" w:lastColumn="0" w:oddVBand="0" w:evenVBand="0" w:oddHBand="1" w:evenHBand="0" w:firstRowFirstColumn="0" w:firstRowLastColumn="0" w:lastRowFirstColumn="0" w:lastRowLastColumn="0"/>
+            </w:pPr>
             <w:r>
               <w:t>Demonstrate core system features and initial risk model implementation</w:t>
             </w:r>
@@ -889,10 +927,12 @@
         <w:tc>
           <w:tcPr>
             <w:tcW w:w="0" w:type="auto"/>
-            <w:vAlign w:val="center"/>
-            <w:hideMark/>
-          </w:tcPr>
-          <w:p>
+            <w:hideMark/>
+          </w:tcPr>
+          <w:p>
+            <w:pPr>
+              <w:cnfStyle w:val="000000100000" w:firstRow="0" w:lastRow="0" w:firstColumn="0" w:lastColumn="0" w:oddVBand="0" w:evenVBand="0" w:oddHBand="1" w:evenHBand="0" w:firstRowFirstColumn="0" w:firstRowLastColumn="0" w:lastRowFirstColumn="0" w:lastRowLastColumn="0"/>
+            </w:pPr>
             <w:r>
               <w:rPr>
                 <w:b/>
@@ -905,12 +945,12 @@
       </w:tr>
       <w:tr>
         <w:trPr>
-          <w:tblCellSpacing w:w="15" w:type="dxa"/>
+          <w:trHeight w:val="860"/>
         </w:trPr>
         <w:tc>
           <w:tcPr>
-            <w:tcW w:w="0" w:type="auto"/>
-            <w:vAlign w:val="center"/>
+            <w:cnfStyle w:val="001000000000" w:firstRow="0" w:lastRow="0" w:firstColumn="1" w:lastColumn="0" w:oddVBand="0" w:evenVBand="0" w:oddHBand="0" w:evenHBand="0" w:firstRowFirstColumn="0" w:firstRowLastColumn="0" w:lastRowFirstColumn="0" w:lastRowLastColumn="0"/>
+            <w:tcW w:w="0" w:type="auto"/>
             <w:hideMark/>
           </w:tcPr>
           <w:p>
@@ -922,10 +962,12 @@
         <w:tc>
           <w:tcPr>
             <w:tcW w:w="0" w:type="auto"/>
-            <w:vAlign w:val="center"/>
-            <w:hideMark/>
-          </w:tcPr>
-          <w:p>
+            <w:hideMark/>
+          </w:tcPr>
+          <w:p>
+            <w:pPr>
+              <w:cnfStyle w:val="000000000000" w:firstRow="0" w:lastRow="0" w:firstColumn="0" w:lastColumn="0" w:oddVBand="0" w:evenVBand="0" w:oddHBand="0" w:evenHBand="0" w:firstRowFirstColumn="0" w:firstRowLastColumn="0" w:lastRowFirstColumn="0" w:lastRowLastColumn="0"/>
+            </w:pPr>
             <w:r>
               <w:t>Refinement &amp; Testing</w:t>
             </w:r>
@@ -934,10 +976,12 @@
         <w:tc>
           <w:tcPr>
             <w:tcW w:w="0" w:type="auto"/>
-            <w:vAlign w:val="center"/>
-            <w:hideMark/>
-          </w:tcPr>
-          <w:p>
+            <w:hideMark/>
+          </w:tcPr>
+          <w:p>
+            <w:pPr>
+              <w:cnfStyle w:val="000000000000" w:firstRow="0" w:lastRow="0" w:firstColumn="0" w:lastColumn="0" w:oddVBand="0" w:evenVBand="0" w:oddHBand="0" w:evenHBand="0" w:firstRowFirstColumn="0" w:firstRowLastColumn="0" w:lastRowFirstColumn="0" w:lastRowLastColumn="0"/>
+            </w:pPr>
             <w:r>
               <w:t>Refine risk model, improve visualizations, fix issues from testing and client feedback</w:t>
             </w:r>
@@ -946,10 +990,12 @@
         <w:tc>
           <w:tcPr>
             <w:tcW w:w="0" w:type="auto"/>
-            <w:vAlign w:val="center"/>
-            <w:hideMark/>
-          </w:tcPr>
-          <w:p>
+            <w:hideMark/>
+          </w:tcPr>
+          <w:p>
+            <w:pPr>
+              <w:cnfStyle w:val="000000000000" w:firstRow="0" w:lastRow="0" w:firstColumn="0" w:lastColumn="0" w:oddVBand="0" w:evenVBand="0" w:oddHBand="0" w:evenHBand="0" w:firstRowFirstColumn="0" w:firstRowLastColumn="0" w:lastRowFirstColumn="0" w:lastRowLastColumn="0"/>
+            </w:pPr>
             <w:r>
               <w:t>Feature complete</w:t>
             </w:r>
@@ -958,12 +1004,13 @@
       </w:tr>
       <w:tr>
         <w:trPr>
-          <w:tblCellSpacing w:w="15" w:type="dxa"/>
+          <w:cnfStyle w:val="000000100000" w:firstRow="0" w:lastRow="0" w:firstColumn="0" w:lastColumn="0" w:oddVBand="0" w:evenVBand="0" w:oddHBand="1" w:evenHBand="0" w:firstRowFirstColumn="0" w:firstRowLastColumn="0" w:lastRowFirstColumn="0" w:lastRowLastColumn="0"/>
+          <w:trHeight w:val="881"/>
         </w:trPr>
         <w:tc>
           <w:tcPr>
-            <w:tcW w:w="0" w:type="auto"/>
-            <w:vAlign w:val="center"/>
+            <w:cnfStyle w:val="001000000000" w:firstRow="0" w:lastRow="0" w:firstColumn="1" w:lastColumn="0" w:oddVBand="0" w:evenVBand="0" w:oddHBand="0" w:evenHBand="0" w:firstRowFirstColumn="0" w:firstRowLastColumn="0" w:lastRowFirstColumn="0" w:lastRowLastColumn="0"/>
+            <w:tcW w:w="0" w:type="auto"/>
             <w:hideMark/>
           </w:tcPr>
           <w:p>
@@ -975,10 +1022,12 @@
         <w:tc>
           <w:tcPr>
             <w:tcW w:w="0" w:type="auto"/>
-            <w:vAlign w:val="center"/>
-            <w:hideMark/>
-          </w:tcPr>
-          <w:p>
+            <w:hideMark/>
+          </w:tcPr>
+          <w:p>
+            <w:pPr>
+              <w:cnfStyle w:val="000000100000" w:firstRow="0" w:lastRow="0" w:firstColumn="0" w:lastColumn="0" w:oddVBand="0" w:evenVBand="0" w:oddHBand="1" w:evenHBand="0" w:firstRowFirstColumn="0" w:firstRowLastColumn="0" w:lastRowFirstColumn="0" w:lastRowLastColumn="0"/>
+            </w:pPr>
             <w:r>
               <w:t>Final Delivery</w:t>
             </w:r>
@@ -987,10 +1036,12 @@
         <w:tc>
           <w:tcPr>
             <w:tcW w:w="0" w:type="auto"/>
-            <w:vAlign w:val="center"/>
-            <w:hideMark/>
-          </w:tcPr>
-          <w:p>
+            <w:hideMark/>
+          </w:tcPr>
+          <w:p>
+            <w:pPr>
+              <w:cnfStyle w:val="000000100000" w:firstRow="0" w:lastRow="0" w:firstColumn="0" w:lastColumn="0" w:oddVBand="0" w:evenVBand="0" w:oddHBand="1" w:evenHBand="0" w:firstRowFirstColumn="0" w:firstRowLastColumn="0" w:lastRowFirstColumn="0" w:lastRowLastColumn="0"/>
+            </w:pPr>
             <w:r>
               <w:t>Finalize system, complete documentation and report, client handover</w:t>
             </w:r>
@@ -999,10 +1050,12 @@
         <w:tc>
           <w:tcPr>
             <w:tcW w:w="0" w:type="auto"/>
-            <w:vAlign w:val="center"/>
-            <w:hideMark/>
-          </w:tcPr>
-          <w:p>
+            <w:hideMark/>
+          </w:tcPr>
+          <w:p>
+            <w:pPr>
+              <w:cnfStyle w:val="000000100000" w:firstRow="0" w:lastRow="0" w:firstColumn="0" w:lastColumn="0" w:oddVBand="0" w:evenVBand="0" w:oddHBand="1" w:evenHBand="0" w:firstRowFirstColumn="0" w:firstRowLastColumn="0" w:lastRowFirstColumn="0" w:lastRowLastColumn="0"/>
+            </w:pPr>
             <w:r>
               <w:rPr>
                 <w:b/>
@@ -1026,102 +1079,81 @@
           <w:b/>
           <w:bCs/>
         </w:rPr>
+        <w:lastRenderedPageBreak/>
         <w:t>3.4 Team Roles and Responsibilities</w:t>
       </w:r>
     </w:p>
     <w:p>
       <w:r>
-        <w:t xml:space="preserve">Responsibilities are shared among the five team members based on their strengths. While each member has a primary role, all members are expected to contribute to discussions, development, and testing throughout the project. The Project Manager role rotates across </w:t>
-      </w:r>
-      <w:r>
-        <w:lastRenderedPageBreak/>
-        <w:t>the three main project phases to ensure shared leadership experience and distribute coordination overhead.</w:t>
+        <w:t>Responsibilities are shared among the five team members based on their strengths. While each member has a primary role, all members are expected to contribute to discussions, development, and testing throughout the project. The Project Manager role rotates across the three main project phases to ensure shared leadership experience and distribute coordination overhead.</w:t>
       </w:r>
     </w:p>
     <w:tbl>
       <w:tblPr>
-        <w:tblW w:w="0" w:type="auto"/>
-        <w:tblCellSpacing w:w="15" w:type="dxa"/>
-        <w:tblCellMar>
-          <w:top w:w="15" w:type="dxa"/>
-          <w:left w:w="15" w:type="dxa"/>
-          <w:bottom w:w="15" w:type="dxa"/>
-          <w:right w:w="15" w:type="dxa"/>
-        </w:tblCellMar>
+        <w:tblStyle w:val="PlainTable1"/>
+        <w:tblW w:w="9404" w:type="dxa"/>
         <w:tblLook w:val="04A0" w:firstRow="1" w:lastRow="0" w:firstColumn="1" w:lastColumn="0" w:noHBand="0" w:noVBand="1"/>
       </w:tblPr>
       <w:tblGrid>
-        <w:gridCol w:w="1764"/>
-        <w:gridCol w:w="4390"/>
-        <w:gridCol w:w="3206"/>
+        <w:gridCol w:w="1947"/>
+        <w:gridCol w:w="4289"/>
+        <w:gridCol w:w="3168"/>
       </w:tblGrid>
       <w:tr>
         <w:trPr>
-          <w:tblHeader/>
-          <w:tblCellSpacing w:w="15" w:type="dxa"/>
+          <w:cnfStyle w:val="100000000000" w:firstRow="1" w:lastRow="0" w:firstColumn="0" w:lastColumn="0" w:oddVBand="0" w:evenVBand="0" w:oddHBand="0" w:evenHBand="0" w:firstRowFirstColumn="0" w:firstRowLastColumn="0" w:lastRowFirstColumn="0" w:lastRowLastColumn="0"/>
+          <w:trHeight w:val="339"/>
         </w:trPr>
         <w:tc>
           <w:tcPr>
-            <w:tcW w:w="0" w:type="auto"/>
-            <w:vAlign w:val="center"/>
+            <w:cnfStyle w:val="001000000000" w:firstRow="0" w:lastRow="0" w:firstColumn="1" w:lastColumn="0" w:oddVBand="0" w:evenVBand="0" w:oddHBand="0" w:evenHBand="0" w:firstRowFirstColumn="0" w:firstRowLastColumn="0" w:lastRowFirstColumn="0" w:lastRowLastColumn="0"/>
+            <w:tcW w:w="0" w:type="auto"/>
             <w:hideMark/>
           </w:tcPr>
           <w:p>
             <w:pPr>
               <w:rPr>
-                <w:b/>
-                <w:bCs/>
+                <w:b w:val="0"/>
+                <w:bCs w:val="0"/>
               </w:rPr>
             </w:pPr>
             <w:r>
+              <w:t>Role</w:t>
+            </w:r>
+          </w:p>
+        </w:tc>
+        <w:tc>
+          <w:tcPr>
+            <w:tcW w:w="0" w:type="auto"/>
+            <w:hideMark/>
+          </w:tcPr>
+          <w:p>
+            <w:pPr>
+              <w:cnfStyle w:val="100000000000" w:firstRow="1" w:lastRow="0" w:firstColumn="0" w:lastColumn="0" w:oddVBand="0" w:evenVBand="0" w:oddHBand="0" w:evenHBand="0" w:firstRowFirstColumn="0" w:firstRowLastColumn="0" w:lastRowFirstColumn="0" w:lastRowLastColumn="0"/>
               <w:rPr>
-                <w:b/>
-                <w:bCs/>
+                <w:b w:val="0"/>
+                <w:bCs w:val="0"/>
               </w:rPr>
-              <w:t>Role</w:t>
-            </w:r>
-          </w:p>
-        </w:tc>
-        <w:tc>
-          <w:tcPr>
-            <w:tcW w:w="0" w:type="auto"/>
-            <w:vAlign w:val="center"/>
-            <w:hideMark/>
-          </w:tcPr>
-          <w:p>
-            <w:pPr>
+            </w:pPr>
+            <w:r>
+              <w:t>Responsibilities</w:t>
+            </w:r>
+          </w:p>
+        </w:tc>
+        <w:tc>
+          <w:tcPr>
+            <w:tcW w:w="0" w:type="auto"/>
+            <w:hideMark/>
+          </w:tcPr>
+          <w:p>
+            <w:pPr>
+              <w:cnfStyle w:val="100000000000" w:firstRow="1" w:lastRow="0" w:firstColumn="0" w:lastColumn="0" w:oddVBand="0" w:evenVBand="0" w:oddHBand="0" w:evenHBand="0" w:firstRowFirstColumn="0" w:firstRowLastColumn="0" w:lastRowFirstColumn="0" w:lastRowLastColumn="0"/>
               <w:rPr>
-                <w:b/>
-                <w:bCs/>
+                <w:b w:val="0"/>
+                <w:bCs w:val="0"/>
               </w:rPr>
             </w:pPr>
             <w:r>
-              <w:rPr>
-                <w:b/>
-                <w:bCs/>
-              </w:rPr>
-              <w:t>Responsibilities</w:t>
-            </w:r>
-          </w:p>
-        </w:tc>
-        <w:tc>
-          <w:tcPr>
-            <w:tcW w:w="0" w:type="auto"/>
-            <w:vAlign w:val="center"/>
-            <w:hideMark/>
-          </w:tcPr>
-          <w:p>
-            <w:pPr>
-              <w:rPr>
-                <w:b/>
-                <w:bCs/>
-              </w:rPr>
-            </w:pPr>
-            <w:r>
-              <w:rPr>
-                <w:b/>
-                <w:bCs/>
-              </w:rPr>
               <w:t>Member</w:t>
             </w:r>
           </w:p>
@@ -1129,12 +1161,13 @@
       </w:tr>
       <w:tr>
         <w:trPr>
-          <w:tblCellSpacing w:w="15" w:type="dxa"/>
+          <w:cnfStyle w:val="000000100000" w:firstRow="0" w:lastRow="0" w:firstColumn="0" w:lastColumn="0" w:oddVBand="0" w:evenVBand="0" w:oddHBand="1" w:evenHBand="0" w:firstRowFirstColumn="0" w:firstRowLastColumn="0" w:lastRowFirstColumn="0" w:lastRowLastColumn="0"/>
+          <w:trHeight w:val="1040"/>
         </w:trPr>
         <w:tc>
           <w:tcPr>
-            <w:tcW w:w="0" w:type="auto"/>
-            <w:vAlign w:val="center"/>
+            <w:cnfStyle w:val="001000000000" w:firstRow="0" w:lastRow="0" w:firstColumn="1" w:lastColumn="0" w:oddVBand="0" w:evenVBand="0" w:oddHBand="0" w:evenHBand="0" w:firstRowFirstColumn="0" w:firstRowLastColumn="0" w:lastRowFirstColumn="0" w:lastRowLastColumn="0"/>
+            <w:tcW w:w="0" w:type="auto"/>
             <w:hideMark/>
           </w:tcPr>
           <w:p>
@@ -1146,10 +1179,12 @@
         <w:tc>
           <w:tcPr>
             <w:tcW w:w="0" w:type="auto"/>
-            <w:vAlign w:val="center"/>
-            <w:hideMark/>
-          </w:tcPr>
-          <w:p>
+            <w:hideMark/>
+          </w:tcPr>
+          <w:p>
+            <w:pPr>
+              <w:cnfStyle w:val="000000100000" w:firstRow="0" w:lastRow="0" w:firstColumn="0" w:lastColumn="0" w:oddVBand="0" w:evenVBand="0" w:oddHBand="1" w:evenHBand="0" w:firstRowFirstColumn="0" w:firstRowLastColumn="0" w:lastRowFirstColumn="0" w:lastRowLastColumn="0"/>
+            </w:pPr>
             <w:r>
               <w:t>Oversee initial project scope, coordinate team setup, manage early milestones and client communication</w:t>
             </w:r>
@@ -1158,10 +1193,12 @@
         <w:tc>
           <w:tcPr>
             <w:tcW w:w="0" w:type="auto"/>
-            <w:vAlign w:val="center"/>
-            <w:hideMark/>
-          </w:tcPr>
-          <w:p>
+            <w:hideMark/>
+          </w:tcPr>
+          <w:p>
+            <w:pPr>
+              <w:cnfStyle w:val="000000100000" w:firstRow="0" w:lastRow="0" w:firstColumn="0" w:lastColumn="0" w:oddVBand="0" w:evenVBand="0" w:oddHBand="1" w:evenHBand="0" w:firstRowFirstColumn="0" w:firstRowLastColumn="0" w:lastRowFirstColumn="0" w:lastRowLastColumn="0"/>
+            </w:pPr>
             <w:r>
               <w:t>Cloud Wang</w:t>
             </w:r>
@@ -1176,12 +1213,12 @@
       </w:tr>
       <w:tr>
         <w:trPr>
-          <w:tblCellSpacing w:w="15" w:type="dxa"/>
+          <w:trHeight w:val="1059"/>
         </w:trPr>
         <w:tc>
           <w:tcPr>
-            <w:tcW w:w="0" w:type="auto"/>
-            <w:vAlign w:val="center"/>
+            <w:cnfStyle w:val="001000000000" w:firstRow="0" w:lastRow="0" w:firstColumn="1" w:lastColumn="0" w:oddVBand="0" w:evenVBand="0" w:oddHBand="0" w:evenHBand="0" w:firstRowFirstColumn="0" w:firstRowLastColumn="0" w:lastRowFirstColumn="0" w:lastRowLastColumn="0"/>
+            <w:tcW w:w="0" w:type="auto"/>
             <w:hideMark/>
           </w:tcPr>
           <w:p>
@@ -1193,10 +1230,12 @@
         <w:tc>
           <w:tcPr>
             <w:tcW w:w="0" w:type="auto"/>
-            <w:vAlign w:val="center"/>
-            <w:hideMark/>
-          </w:tcPr>
-          <w:p>
+            <w:hideMark/>
+          </w:tcPr>
+          <w:p>
+            <w:pPr>
+              <w:cnfStyle w:val="000000000000" w:firstRow="0" w:lastRow="0" w:firstColumn="0" w:lastColumn="0" w:oddVBand="0" w:evenVBand="0" w:oddHBand="0" w:evenHBand="0" w:firstRowFirstColumn="0" w:firstRowLastColumn="0" w:lastRowFirstColumn="0" w:lastRowLastColumn="0"/>
+            </w:pPr>
             <w:r>
               <w:t>Coordinate mid-project development sprints, track progress, manage client feedback and D2 submission</w:t>
             </w:r>
@@ -1205,10 +1244,12 @@
         <w:tc>
           <w:tcPr>
             <w:tcW w:w="0" w:type="auto"/>
-            <w:vAlign w:val="center"/>
-            <w:hideMark/>
-          </w:tcPr>
-          <w:p>
+            <w:hideMark/>
+          </w:tcPr>
+          <w:p>
+            <w:pPr>
+              <w:cnfStyle w:val="000000000000" w:firstRow="0" w:lastRow="0" w:firstColumn="0" w:lastColumn="0" w:oddVBand="0" w:evenVBand="0" w:oddHBand="0" w:evenHBand="0" w:firstRowFirstColumn="0" w:firstRowLastColumn="0" w:lastRowFirstColumn="0" w:lastRowLastColumn="0"/>
+            </w:pPr>
             <w:r>
               <w:t>Chinmai Ravindran</w:t>
             </w:r>
@@ -1221,12 +1262,13 @@
       </w:tr>
       <w:tr>
         <w:trPr>
-          <w:tblCellSpacing w:w="15" w:type="dxa"/>
+          <w:cnfStyle w:val="000000100000" w:firstRow="0" w:lastRow="0" w:firstColumn="0" w:lastColumn="0" w:oddVBand="0" w:evenVBand="0" w:oddHBand="1" w:evenHBand="0" w:firstRowFirstColumn="0" w:firstRowLastColumn="0" w:lastRowFirstColumn="0" w:lastRowLastColumn="0"/>
+          <w:trHeight w:val="1040"/>
         </w:trPr>
         <w:tc>
           <w:tcPr>
-            <w:tcW w:w="0" w:type="auto"/>
-            <w:vAlign w:val="center"/>
+            <w:cnfStyle w:val="001000000000" w:firstRow="0" w:lastRow="0" w:firstColumn="1" w:lastColumn="0" w:oddVBand="0" w:evenVBand="0" w:oddHBand="0" w:evenHBand="0" w:firstRowFirstColumn="0" w:firstRowLastColumn="0" w:lastRowFirstColumn="0" w:lastRowLastColumn="0"/>
+            <w:tcW w:w="0" w:type="auto"/>
             <w:hideMark/>
           </w:tcPr>
           <w:p>
@@ -1238,10 +1280,12 @@
         <w:tc>
           <w:tcPr>
             <w:tcW w:w="0" w:type="auto"/>
-            <w:vAlign w:val="center"/>
-            <w:hideMark/>
-          </w:tcPr>
-          <w:p>
+            <w:hideMark/>
+          </w:tcPr>
+          <w:p>
+            <w:pPr>
+              <w:cnfStyle w:val="000000100000" w:firstRow="0" w:lastRow="0" w:firstColumn="0" w:lastColumn="0" w:oddVBand="0" w:evenVBand="0" w:oddHBand="1" w:evenHBand="0" w:firstRowFirstColumn="0" w:firstRowLastColumn="0" w:lastRowFirstColumn="0" w:lastRowLastColumn="0"/>
+            </w:pPr>
             <w:r>
               <w:t>Lead final development and testing phases, coordinate D3 delivery and client handover</w:t>
             </w:r>
@@ -1250,10 +1294,12 @@
         <w:tc>
           <w:tcPr>
             <w:tcW w:w="0" w:type="auto"/>
-            <w:vAlign w:val="center"/>
-            <w:hideMark/>
-          </w:tcPr>
-          <w:p>
+            <w:hideMark/>
+          </w:tcPr>
+          <w:p>
+            <w:pPr>
+              <w:cnfStyle w:val="000000100000" w:firstRow="0" w:lastRow="0" w:firstColumn="0" w:lastColumn="0" w:oddVBand="0" w:evenVBand="0" w:oddHBand="1" w:evenHBand="0" w:firstRowFirstColumn="0" w:firstRowLastColumn="0" w:lastRowFirstColumn="0" w:lastRowLastColumn="0"/>
+            </w:pPr>
             <w:r>
               <w:t xml:space="preserve">Chowdhury Ramim Bin Azam </w:t>
             </w:r>
@@ -1270,17 +1316,21 @@
               <w:t>24644535</w:t>
             </w:r>
           </w:p>
-          <w:p/>
+          <w:p>
+            <w:pPr>
+              <w:cnfStyle w:val="000000100000" w:firstRow="0" w:lastRow="0" w:firstColumn="0" w:lastColumn="0" w:oddVBand="0" w:evenVBand="0" w:oddHBand="1" w:evenHBand="0" w:firstRowFirstColumn="0" w:firstRowLastColumn="0" w:lastRowFirstColumn="0" w:lastRowLastColumn="0"/>
+            </w:pPr>
+          </w:p>
         </w:tc>
       </w:tr>
       <w:tr>
         <w:trPr>
-          <w:tblCellSpacing w:w="15" w:type="dxa"/>
+          <w:trHeight w:val="1040"/>
         </w:trPr>
         <w:tc>
           <w:tcPr>
-            <w:tcW w:w="0" w:type="auto"/>
-            <w:vAlign w:val="center"/>
+            <w:cnfStyle w:val="001000000000" w:firstRow="0" w:lastRow="0" w:firstColumn="1" w:lastColumn="0" w:oddVBand="0" w:evenVBand="0" w:oddHBand="0" w:evenHBand="0" w:firstRowFirstColumn="0" w:firstRowLastColumn="0" w:lastRowFirstColumn="0" w:lastRowLastColumn="0"/>
+            <w:tcW w:w="0" w:type="auto"/>
             <w:hideMark/>
           </w:tcPr>
           <w:p>
@@ -1292,10 +1342,12 @@
         <w:tc>
           <w:tcPr>
             <w:tcW w:w="0" w:type="auto"/>
-            <w:vAlign w:val="center"/>
-            <w:hideMark/>
-          </w:tcPr>
-          <w:p>
+            <w:hideMark/>
+          </w:tcPr>
+          <w:p>
+            <w:pPr>
+              <w:cnfStyle w:val="000000000000" w:firstRow="0" w:lastRow="0" w:firstColumn="0" w:lastColumn="0" w:oddVBand="0" w:evenVBand="0" w:oddHBand="0" w:evenHBand="0" w:firstRowFirstColumn="0" w:firstRowLastColumn="0" w:lastRowFirstColumn="0" w:lastRowLastColumn="0"/>
+            </w:pPr>
             <w:r>
               <w:t>Collaboratively design and implement the web application UI, including the interactive GIS map interface</w:t>
             </w:r>
@@ -1304,10 +1356,12 @@
         <w:tc>
           <w:tcPr>
             <w:tcW w:w="0" w:type="auto"/>
-            <w:vAlign w:val="center"/>
-            <w:hideMark/>
-          </w:tcPr>
-          <w:p>
+            <w:hideMark/>
+          </w:tcPr>
+          <w:p>
+            <w:pPr>
+              <w:cnfStyle w:val="000000000000" w:firstRow="0" w:lastRow="0" w:firstColumn="0" w:lastColumn="0" w:oddVBand="0" w:evenVBand="0" w:oddHBand="0" w:evenHBand="0" w:firstRowFirstColumn="0" w:firstRowLastColumn="0" w:lastRowFirstColumn="0" w:lastRowLastColumn="0"/>
+            </w:pPr>
             <w:r>
               <w:t>All Members</w:t>
             </w:r>
@@ -1316,12 +1370,13 @@
       </w:tr>
       <w:tr>
         <w:trPr>
-          <w:tblCellSpacing w:w="15" w:type="dxa"/>
+          <w:cnfStyle w:val="000000100000" w:firstRow="0" w:lastRow="0" w:firstColumn="0" w:lastColumn="0" w:oddVBand="0" w:evenVBand="0" w:oddHBand="1" w:evenHBand="0" w:firstRowFirstColumn="0" w:firstRowLastColumn="0" w:lastRowFirstColumn="0" w:lastRowLastColumn="0"/>
+          <w:trHeight w:val="1059"/>
         </w:trPr>
         <w:tc>
           <w:tcPr>
-            <w:tcW w:w="0" w:type="auto"/>
-            <w:vAlign w:val="center"/>
+            <w:cnfStyle w:val="001000000000" w:firstRow="0" w:lastRow="0" w:firstColumn="1" w:lastColumn="0" w:oddVBand="0" w:evenVBand="0" w:oddHBand="0" w:evenHBand="0" w:firstRowFirstColumn="0" w:firstRowLastColumn="0" w:lastRowFirstColumn="0" w:lastRowLastColumn="0"/>
+            <w:tcW w:w="0" w:type="auto"/>
             <w:hideMark/>
           </w:tcPr>
           <w:p>
@@ -1333,10 +1388,12 @@
         <w:tc>
           <w:tcPr>
             <w:tcW w:w="0" w:type="auto"/>
-            <w:vAlign w:val="center"/>
-            <w:hideMark/>
-          </w:tcPr>
-          <w:p>
+            <w:hideMark/>
+          </w:tcPr>
+          <w:p>
+            <w:pPr>
+              <w:cnfStyle w:val="000000100000" w:firstRow="0" w:lastRow="0" w:firstColumn="0" w:lastColumn="0" w:oddVBand="0" w:evenVBand="0" w:oddHBand="1" w:evenHBand="0" w:firstRowFirstColumn="0" w:firstRowLastColumn="0" w:lastRowFirstColumn="0" w:lastRowLastColumn="0"/>
+            </w:pPr>
             <w:r>
               <w:t>Implement server-side logic, risk assessment algorithm, and data processing pipelines</w:t>
             </w:r>
@@ -1345,10 +1402,12 @@
         <w:tc>
           <w:tcPr>
             <w:tcW w:w="0" w:type="auto"/>
-            <w:vAlign w:val="center"/>
-            <w:hideMark/>
-          </w:tcPr>
-          <w:p>
+            <w:hideMark/>
+          </w:tcPr>
+          <w:p>
+            <w:pPr>
+              <w:cnfStyle w:val="000000100000" w:firstRow="0" w:lastRow="0" w:firstColumn="0" w:lastColumn="0" w:oddVBand="0" w:evenVBand="0" w:oddHBand="1" w:evenHBand="0" w:firstRowFirstColumn="0" w:firstRowLastColumn="0" w:lastRowFirstColumn="0" w:lastRowLastColumn="0"/>
+            </w:pPr>
             <w:r>
               <w:t>Cloud Wang</w:t>
             </w:r>
@@ -1363,12 +1422,12 @@
       </w:tr>
       <w:tr>
         <w:trPr>
-          <w:tblCellSpacing w:w="15" w:type="dxa"/>
+          <w:trHeight w:val="1382"/>
         </w:trPr>
         <w:tc>
           <w:tcPr>
-            <w:tcW w:w="0" w:type="auto"/>
-            <w:vAlign w:val="center"/>
+            <w:cnfStyle w:val="001000000000" w:firstRow="0" w:lastRow="0" w:firstColumn="1" w:lastColumn="0" w:oddVBand="0" w:evenVBand="0" w:oddHBand="0" w:evenHBand="0" w:firstRowFirstColumn="0" w:firstRowLastColumn="0" w:lastRowFirstColumn="0" w:lastRowLastColumn="0"/>
+            <w:tcW w:w="0" w:type="auto"/>
             <w:hideMark/>
           </w:tcPr>
           <w:p>
@@ -1380,10 +1439,12 @@
         <w:tc>
           <w:tcPr>
             <w:tcW w:w="0" w:type="auto"/>
-            <w:vAlign w:val="center"/>
-            <w:hideMark/>
-          </w:tcPr>
-          <w:p>
+            <w:hideMark/>
+          </w:tcPr>
+          <w:p>
+            <w:pPr>
+              <w:cnfStyle w:val="000000000000" w:firstRow="0" w:lastRow="0" w:firstColumn="0" w:lastColumn="0" w:oddVBand="0" w:evenVBand="0" w:oddHBand="0" w:evenHBand="0" w:firstRowFirstColumn="0" w:firstRowLastColumn="0" w:lastRowFirstColumn="0" w:lastRowLastColumn="0"/>
+            </w:pPr>
             <w:r>
               <w:t>Source, process, and integrate geospatial datasets (e.g., vegetation, elevation, fuel load, granite outcrops) into the application</w:t>
             </w:r>
@@ -1392,28 +1453,36 @@
         <w:tc>
           <w:tcPr>
             <w:tcW w:w="0" w:type="auto"/>
-            <w:vAlign w:val="center"/>
-            <w:hideMark/>
-          </w:tcPr>
-          <w:p>
+            <w:hideMark/>
+          </w:tcPr>
+          <w:p>
+            <w:pPr>
+              <w:cnfStyle w:val="000000000000" w:firstRow="0" w:lastRow="0" w:firstColumn="0" w:lastColumn="0" w:oddVBand="0" w:evenVBand="0" w:oddHBand="0" w:evenHBand="0" w:firstRowFirstColumn="0" w:firstRowLastColumn="0" w:lastRowFirstColumn="0" w:lastRowLastColumn="0"/>
+            </w:pPr>
             <w:r>
               <w:t>Difu Xiao</w:t>
             </w:r>
             <w:r>
-              <w:br/>
+              <w:t xml:space="preserve"> (</w:t>
+            </w:r>
+            <w:r>
               <w:t>24473616</w:t>
+            </w:r>
+            <w:r>
+              <w:t>), Chinmai Ravindran (23864156)</w:t>
             </w:r>
           </w:p>
         </w:tc>
       </w:tr>
       <w:tr>
         <w:trPr>
-          <w:tblCellSpacing w:w="15" w:type="dxa"/>
+          <w:cnfStyle w:val="000000100000" w:firstRow="0" w:lastRow="0" w:firstColumn="0" w:lastColumn="0" w:oddVBand="0" w:evenVBand="0" w:oddHBand="1" w:evenHBand="0" w:firstRowFirstColumn="0" w:firstRowLastColumn="0" w:lastRowFirstColumn="0" w:lastRowLastColumn="0"/>
+          <w:trHeight w:val="1400"/>
         </w:trPr>
         <w:tc>
           <w:tcPr>
-            <w:tcW w:w="0" w:type="auto"/>
-            <w:vAlign w:val="center"/>
+            <w:cnfStyle w:val="001000000000" w:firstRow="0" w:lastRow="0" w:firstColumn="1" w:lastColumn="0" w:oddVBand="0" w:evenVBand="0" w:oddHBand="0" w:evenHBand="0" w:firstRowFirstColumn="0" w:firstRowLastColumn="0" w:lastRowFirstColumn="0" w:lastRowLastColumn="0"/>
+            <w:tcW w:w="0" w:type="auto"/>
             <w:hideMark/>
           </w:tcPr>
           <w:p>
@@ -1425,10 +1494,12 @@
         <w:tc>
           <w:tcPr>
             <w:tcW w:w="0" w:type="auto"/>
-            <w:vAlign w:val="center"/>
-            <w:hideMark/>
-          </w:tcPr>
-          <w:p>
+            <w:hideMark/>
+          </w:tcPr>
+          <w:p>
+            <w:pPr>
+              <w:cnfStyle w:val="000000100000" w:firstRow="0" w:lastRow="0" w:firstColumn="0" w:lastColumn="0" w:oddVBand="0" w:evenVBand="0" w:oddHBand="1" w:evenHBand="0" w:firstRowFirstColumn="0" w:firstRowLastColumn="0" w:lastRowFirstColumn="0" w:lastRowLastColumn="0"/>
+            </w:pPr>
             <w:r>
               <w:t>Design and execute test plans covering functionality, performance, and edge cases</w:t>
             </w:r>
@@ -1437,11 +1508,11 @@
         <w:tc>
           <w:tcPr>
             <w:tcW w:w="0" w:type="auto"/>
-            <w:vAlign w:val="center"/>
-            <w:hideMark/>
-          </w:tcPr>
-          <w:p>
-            <w:pPr>
+            <w:hideMark/>
+          </w:tcPr>
+          <w:p>
+            <w:pPr>
+              <w:cnfStyle w:val="000000100000" w:firstRow="0" w:lastRow="0" w:firstColumn="0" w:lastColumn="0" w:oddVBand="0" w:evenVBand="0" w:oddHBand="1" w:evenHBand="0" w:firstRowFirstColumn="0" w:firstRowLastColumn="0" w:lastRowFirstColumn="0" w:lastRowLastColumn="0"/>
               <w:rPr>
                 <w:b/>
                 <w:bCs/>
@@ -1480,17 +1551,21 @@
               <w:t> </w:t>
             </w:r>
           </w:p>
-          <w:p/>
+          <w:p>
+            <w:pPr>
+              <w:cnfStyle w:val="000000100000" w:firstRow="0" w:lastRow="0" w:firstColumn="0" w:lastColumn="0" w:oddVBand="0" w:evenVBand="0" w:oddHBand="1" w:evenHBand="0" w:firstRowFirstColumn="0" w:firstRowLastColumn="0" w:lastRowFirstColumn="0" w:lastRowLastColumn="0"/>
+            </w:pPr>
+          </w:p>
         </w:tc>
       </w:tr>
       <w:tr>
         <w:trPr>
-          <w:tblCellSpacing w:w="15" w:type="dxa"/>
+          <w:trHeight w:val="1400"/>
         </w:trPr>
         <w:tc>
           <w:tcPr>
-            <w:tcW w:w="0" w:type="auto"/>
-            <w:vAlign w:val="center"/>
+            <w:cnfStyle w:val="001000000000" w:firstRow="0" w:lastRow="0" w:firstColumn="1" w:lastColumn="0" w:oddVBand="0" w:evenVBand="0" w:oddHBand="0" w:evenHBand="0" w:firstRowFirstColumn="0" w:firstRowLastColumn="0" w:lastRowFirstColumn="0" w:lastRowLastColumn="0"/>
+            <w:tcW w:w="0" w:type="auto"/>
             <w:hideMark/>
           </w:tcPr>
           <w:p>
@@ -1502,10 +1577,12 @@
         <w:tc>
           <w:tcPr>
             <w:tcW w:w="0" w:type="auto"/>
-            <w:vAlign w:val="center"/>
-            <w:hideMark/>
-          </w:tcPr>
-          <w:p>
+            <w:hideMark/>
+          </w:tcPr>
+          <w:p>
+            <w:pPr>
+              <w:cnfStyle w:val="000000000000" w:firstRow="0" w:lastRow="0" w:firstColumn="0" w:lastColumn="0" w:oddVBand="0" w:evenVBand="0" w:oddHBand="0" w:evenHBand="0" w:firstRowFirstColumn="0" w:firstRowLastColumn="0" w:lastRowFirstColumn="0" w:lastRowLastColumn="0"/>
+            </w:pPr>
             <w:r>
               <w:t>Prepare and maintain project documentation, meeting minutes, and deliverable reports</w:t>
             </w:r>
@@ -1514,12 +1591,20 @@
         <w:tc>
           <w:tcPr>
             <w:tcW w:w="0" w:type="auto"/>
-            <w:vAlign w:val="center"/>
-            <w:hideMark/>
-          </w:tcPr>
-          <w:p>
-            <w:r>
-              <w:t>Cloud Want (</w:t>
+            <w:hideMark/>
+          </w:tcPr>
+          <w:p>
+            <w:pPr>
+              <w:cnfStyle w:val="000000000000" w:firstRow="0" w:lastRow="0" w:firstColumn="0" w:lastColumn="0" w:oddVBand="0" w:evenVBand="0" w:oddHBand="0" w:evenHBand="0" w:firstRowFirstColumn="0" w:firstRowLastColumn="0" w:lastRowFirstColumn="0" w:lastRowLastColumn="0"/>
+            </w:pPr>
+            <w:r>
+              <w:t>Cloud Wan</w:t>
+            </w:r>
+            <w:r>
+              <w:t>g</w:t>
+            </w:r>
+            <w:r>
+              <w:t xml:space="preserve"> (</w:t>
             </w:r>
             <w:r>
               <w:t>24408996</w:t>
@@ -1581,7 +1666,18 @@
       </w:r>
       <w:proofErr w:type="spellEnd"/>
       <w:r>
-        <w:t xml:space="preserve"> serves as the main platform for version control and code management. It allows team members to work simultaneously, track changes, manage branches, and conduct pull request reviews before merging into main. Going forward, the team will also use GitHub Issues and Milestones to log and track tasks, bugs, and features aligned to each deliverable.</w:t>
+        <w:t xml:space="preserve"> serves as the main platform for version control and code management. It allows team members to work simultaneously, track changes, manage branches, and conduct pull request reviews before merging into </w:t>
+      </w:r>
+      <w:proofErr w:type="gramStart"/>
+      <w:r>
+        <w:t>main</w:t>
+      </w:r>
+      <w:proofErr w:type="gramEnd"/>
+      <w:r>
+        <w:t>.</w:t>
+      </w:r>
+      <w:r>
+        <w:t xml:space="preserve"> GitHub Issues and Milestones are used to track tasks and align them with project deliverables, providing clear visibility of overall progress.</w:t>
       </w:r>
     </w:p>
     <w:p>
@@ -1608,7 +1704,7 @@
       <w:r>
         <w:t xml:space="preserve">Link: </w:t>
       </w:r>
-      <w:hyperlink r:id="rId5" w:history="1">
+      <w:hyperlink r:id="rId6" w:history="1">
         <w:r>
           <w:rPr>
             <w:rStyle w:val="Hyperlink"/>
@@ -1641,12 +1737,15 @@
       <w:r>
         <w:t xml:space="preserve"> is used to store and share project documents, including meeting minutes, team accountability records, relevant research papers, and other reference materials. This ensures all members have consistent access to the latest documents regardless of location.</w:t>
       </w:r>
+      <w:r>
+        <w:t xml:space="preserve"> Meeting minutes are uploaded after each session to document key decisions and assigned tasks, while weekly accountability records are maintained to track individual contributions across the team.</w:t>
+      </w:r>
     </w:p>
     <w:p>
       <w:r>
         <w:t xml:space="preserve">Link: </w:t>
       </w:r>
-      <w:hyperlink r:id="rId6" w:history="1">
+      <w:hyperlink r:id="rId7" w:history="1">
         <w:r>
           <w:rPr>
             <w:rStyle w:val="Hyperlink"/>
@@ -1705,6 +1804,7 @@
           <w:b/>
           <w:bCs/>
         </w:rPr>
+        <w:lastRenderedPageBreak/>
         <w:t>Ad-hoc Check-ins:</w:t>
       </w:r>
       <w:r>
@@ -1723,11 +1823,28 @@
           <w:b/>
           <w:bCs/>
         </w:rPr>
-        <w:lastRenderedPageBreak/>
         <w:t>Client Updates:</w:t>
       </w:r>
       <w:r>
         <w:t xml:space="preserve"> Progress summaries shared bi-weekly, ensuring continuous feedback and alignment on MVP features.</w:t>
+      </w:r>
+    </w:p>
+    <w:p>
+      <w:r>
+        <w:t xml:space="preserve">Software Deployment During development and testing, the system will run locally to allow rapid iteration. Once core features are stable, the application will be deployed as a web application to a cloud platform such as </w:t>
+      </w:r>
+      <w:proofErr w:type="spellStart"/>
+      <w:r>
+        <w:t>Vercel</w:t>
+      </w:r>
+      <w:proofErr w:type="spellEnd"/>
+      <w:r>
+        <w:t>, enabling broader accessibility for client demonstrations and eventual handover.</w:t>
+      </w:r>
+    </w:p>
+    <w:p>
+      <w:r>
+        <w:t>Together, these tools and practices enable continuous tracking of tasks and effective coordination across the team through the project lifecycle.</w:t>
       </w:r>
     </w:p>
     <w:p/>
@@ -2622,6 +2739,7 @@
   <w:style w:type="character" w:default="1" w:styleId="DefaultParagraphFont">
     <w:name w:val="Default Paragraph Font"/>
     <w:uiPriority w:val="1"/>
+    <w:semiHidden/>
     <w:unhideWhenUsed/>
   </w:style>
   <w:style w:type="table" w:default="1" w:styleId="TableNormal">
@@ -2957,6 +3075,69 @@
       <w:color w:val="605E5C"/>
       <w:shd w:val="clear" w:color="auto" w:fill="E1DFDD"/>
     </w:rPr>
+  </w:style>
+  <w:style w:type="table" w:styleId="PlainTable1">
+    <w:name w:val="Plain Table 1"/>
+    <w:basedOn w:val="TableNormal"/>
+    <w:uiPriority w:val="41"/>
+    <w:rsid w:val="0041480C"/>
+    <w:pPr>
+      <w:spacing w:after="0" w:line="240" w:lineRule="auto"/>
+    </w:pPr>
+    <w:tblPr>
+      <w:tblStyleRowBandSize w:val="1"/>
+      <w:tblStyleColBandSize w:val="1"/>
+      <w:tblBorders>
+        <w:top w:val="single" w:sz="4" w:space="0" w:color="BFBFBF" w:themeColor="background1" w:themeShade="BF"/>
+        <w:left w:val="single" w:sz="4" w:space="0" w:color="BFBFBF" w:themeColor="background1" w:themeShade="BF"/>
+        <w:bottom w:val="single" w:sz="4" w:space="0" w:color="BFBFBF" w:themeColor="background1" w:themeShade="BF"/>
+        <w:right w:val="single" w:sz="4" w:space="0" w:color="BFBFBF" w:themeColor="background1" w:themeShade="BF"/>
+        <w:insideH w:val="single" w:sz="4" w:space="0" w:color="BFBFBF" w:themeColor="background1" w:themeShade="BF"/>
+        <w:insideV w:val="single" w:sz="4" w:space="0" w:color="BFBFBF" w:themeColor="background1" w:themeShade="BF"/>
+      </w:tblBorders>
+    </w:tblPr>
+    <w:tblStylePr w:type="firstRow">
+      <w:rPr>
+        <w:b/>
+        <w:bCs/>
+      </w:rPr>
+    </w:tblStylePr>
+    <w:tblStylePr w:type="lastRow">
+      <w:rPr>
+        <w:b/>
+        <w:bCs/>
+      </w:rPr>
+      <w:tblPr/>
+      <w:tcPr>
+        <w:tcBorders>
+          <w:top w:val="double" w:sz="4" w:space="0" w:color="BFBFBF" w:themeColor="background1" w:themeShade="BF"/>
+        </w:tcBorders>
+      </w:tcPr>
+    </w:tblStylePr>
+    <w:tblStylePr w:type="firstCol">
+      <w:rPr>
+        <w:b/>
+        <w:bCs/>
+      </w:rPr>
+    </w:tblStylePr>
+    <w:tblStylePr w:type="lastCol">
+      <w:rPr>
+        <w:b/>
+        <w:bCs/>
+      </w:rPr>
+    </w:tblStylePr>
+    <w:tblStylePr w:type="band1Vert">
+      <w:tblPr/>
+      <w:tcPr>
+        <w:shd w:val="clear" w:color="auto" w:fill="F2F2F2" w:themeFill="background1" w:themeFillShade="F2"/>
+      </w:tcPr>
+    </w:tblStylePr>
+    <w:tblStylePr w:type="band1Horz">
+      <w:tblPr/>
+      <w:tcPr>
+        <w:shd w:val="clear" w:color="auto" w:fill="F2F2F2" w:themeFill="background1" w:themeFillShade="F2"/>
+      </w:tcPr>
+    </w:tblStylePr>
   </w:style>
 </w:styles>
 </file>
@@ -3254,4 +3435,16 @@
     </a:ext>
   </a:extLst>
 </a:theme>
+</file>
+
+<file path=customXml/item1.xml><?xml version="1.0" encoding="utf-8"?>
+<b:Sources xmlns:b="http://schemas.openxmlformats.org/officeDocument/2006/bibliography" xmlns="http://schemas.openxmlformats.org/officeDocument/2006/bibliography" SelectedStyle="\APASixthEditionOfficeOnline.xsl" StyleName="APA" Version="6"/>
+</file>
+
+<file path=customXml/itemProps1.xml><?xml version="1.0" encoding="utf-8"?>
+<ds:datastoreItem xmlns:ds="http://schemas.openxmlformats.org/officeDocument/2006/customXml" ds:itemID="{D3CF043B-1666-42FA-86DC-15C2D7EB7A05}">
+  <ds:schemaRefs>
+    <ds:schemaRef ds:uri="http://schemas.openxmlformats.org/officeDocument/2006/bibliography"/>
+  </ds:schemaRefs>
+</ds:datastoreItem>
 </file>
</xml_diff>